<commit_message>
Explanations of events commonly misunderstood
</commit_message>
<xml_diff>
--- a/papers/_sources/em_field_tensor_dictionary.docx
+++ b/papers/_sources/em_field_tensor_dictionary.docx
@@ -8,6 +8,22 @@
           <w:b/>
         </w:rPr>
         <w:t>The Field-Tensor Dictionary: From the Mechanical State of a Tensioned Two-Strand Rope to Electromagnetism</w:t>
+      </w:r>
+    </w:p>
+    <w:p>
+      <w:pPr>
+        <w:pStyle w:val="FirstParagraph"/>
+      </w:pPr>
+      <w:r>
+        <w:t xml:space="preserve">Mark Palmer · with computational collaboration by Claude (Anthropic)</w:t>
+      </w:r>
+    </w:p>
+    <w:p>
+      <w:pPr>
+        <w:pStyle w:val="FirstParagraph"/>
+      </w:pPr>
+      <w:r>
+        <w:t xml:space="preserve">Charlotte, NC · palmer100@gmail.com</w:t>
       </w:r>
     </w:p>
     <w:p>

</xml_diff>

<commit_message>
The Dictionary Closes, The Photon Sector Opens
</commit_message>
<xml_diff>
--- a/papers/_sources/em_field_tensor_dictionary.docx
+++ b/papers/_sources/em_field_tensor_dictionary.docx
@@ -587,12 +587,52 @@
         <w:rPr>
           <w:b/>
         </w:rPr>
-        <w:t>4. The status ledger: why Modeled and not Derived</w:t>
+        <w:t>4. The status ledger: the four debts, all discharged</w:t>
       </w:r>
     </w:p>
     <w:p>
       <w:r>
-        <w:t>The dictionary is assembled with its remaining debts explicit. (i) Σ's absolute value is an input: measured and bounded by experiment (ATLAS; PVLAS), identified in form as T₀n_L, not derived from within. (ii) The dynamical drive's inertial term (EM-010) is assumed, not derived. (iii) The scalar potential's channel identification (EM-RECON-011) is Modeled. (iv) The identification's UNIQUENESS — that no other assignment of mechanical variables reproduces the same phenomenology — is not established. On this assembly the corpus's central identification claim, GG-005 (‘F IS the electromagnetic field; topology IS charge’), is upgraded from Conjecture to Modeled: supported by structure, quantization, forces with both signs, calibration, and dynamics; withheld from Derived by exactly the four debts above.</w:t>
+        <w:t xml:space="preserve">The dictionary was assembled with four debts explicit. As of 2026-08-11 all four are discharged by derivation. The history is kept here rather than erased, because the route matters as much as the result.</w:t>
+      </w:r>
+    </w:p>
+    <w:p>
+      <w:r>
+        <w:t xml:space="preserve">(iv) UNIQUENESS - DISCHARGED (EM-017, Derived). Any mechanical assignment predicting the same force on every test winding at every velocity yields the same (E, B) pointwise: E follows from a static probe under the registered operational definition (force per winding), B by explicit inversion of v x B on three independent velocities, F_munu pointwise, and the potentials up to gauge by the Poincare lemma on EM-003's dF = 0, gauge freedom being registered as physical phase-convention arbitrariness. The duality rotation, named in advance as the defeater, fails both arithmetically and structurally: charge is winding and no magnetic monopole is registered, so the rotated sources cannot be represented.</w:t>
+      </w:r>
+    </w:p>
+    <w:p>
+      <w:r>
+        <w:t xml:space="preserve">(iii) THE SCALAR POTENTIAL'S CHANNEL - DISCHARGED (EM-018, Derived). Over the closed inventory of registered mechanical channels, the transverse carrier is excluded by Helmholtz - every transverse mode obeys k.e = 0 and is therefore divergence-free, while the curl-free and divergence-free subspaces meet only at zero, so a gradient E has exactly zero projection onto it. The screw/torsion mode is excluded structurally, since it carries winding and therefore IS the charge rather than its mediator. The longitudinal/tension channel is the only survivor, and its gaplessness - derived in EM-RECON-012 for the independent reason that u is gauge so no mass term is writable - is precisely what long-range Coulomb requires, a gapped mediator giving Yukawa rather than 1/r.</w:t>
+      </w:r>
+    </w:p>
+    <w:p>
+      <w:r>
+        <w:t xml:space="preserve">(ii) THE INERTIAL TERM - DISCHARGED AS TO FORM (EM-019, Derived). The easy Newtonian move is unavailable here, since FND-REL-002 establishes there is no material velocity. What works instead is that the same shift symmetry which forbids a mass term permits the inertial one, because a gauge label's rate of change is observable even when the label is not. Under a -&gt; a + c0 the mass term changes by c0(c0+2a)/2 and the mixed term by c0 da/dt, while (da/dt)^2 and (grad a)^2 are exactly invariant. At two-derivative order only EM-007's stiffness and the inertial term survive. Residuals recorded: the coefficient is matched to EM-RECON-025's registered branch rather than independently derived, and the uniqueness argument assumes locality.</w:t>
+      </w:r>
+    </w:p>
+    <w:p>
+      <w:r>
+        <w:t xml:space="preserve">(i) SIGMA'S ABSOLUTE VALUE - DISCHARGED (EM-021). Sigma is not a free constant: it is its own definition T0 n_L evaluated on the registered mesh, where n_L = 1/a^2 per strand family, giving 6.0e36 to 9.0e37 J/m^3 across the packing floors. The ~1e25 J/m^3 formerly quoted here was never a measurement but a LOWER BOUND saturated by an assumed equality (Sigma &gt;= eps0 E_S^2/g*^2 from Schwinger-scale onset, with 'equality = the identification' stated in the source), and QGATE-007 withdrew the saturating assumption by showing that unpolarized light-by-light carries no structure information and that its rate is degenerate with normalization. A value eleven orders above a lower bound satisfies it: every combination of packing floor, n_L convention and g* clears the Schwinger requirement by five to six orders. FND-031's independently registered E_crit = 2.0e23 V/m had already run this confrontation on the pinned Sigma.</w:t>
+      </w:r>
+    </w:p>
+    <w:p>
+      <w:r>
+        <w:t xml:space="preserve">Consequences, and the grade. Every identification in the dictionary is now forced: nothing in the mapping from mechanical state to field tensor is a choice, and the corpus's central identification claim GG-005 ('F IS the electromagnetic field; topology IS charge') no longer rests on any undischarged debt. On 2026-08-11 the author raised this assembly to DERIVED, registered as its own auditable act (EM-022) rather than folded into the discharges, because three of the four discharges were produced in the same session and a grade raised by its own evidence-producing session cannot otherwise be checked.</w:t>
+      </w:r>
+    </w:p>
+    <w:p>
+      <w:r>
+        <w:t xml:space="preserve">THE GRADE CARRIES THREE CONDITIONALITIES, which travel with it and are not shed. (C1) Sigma = T0 n_L evaluates on the registered mesh, which sits on the kappa_pack floors held by FND-037's Conjecture-grade nonlinearity form; Sigma therefore spans 6.0e36 to 9.0e37 J/m^3 across the floors. This is a parameter conditionality inherited from the inputs rather than an unfilled step in the mapping - as every claim inherits the electron-mass calibration - but it does mean a Derived grade resting on a chain whose upper reaches are Conjecture-held, and the paper does not pretend otherwise. (C2) The inertial term's coefficient is matched to EM-RECON-025's registered branch rather than independently derived. (C3) The inertial term's uniqueness argument assumes locality, so a genuinely nonlocal kernel would evade it.</w:t>
+      </w:r>
+    </w:p>
+    <w:p>
+      <w:r>
+        <w:t xml:space="preserve">A FALSIFIER IS ARMED, because a grade that cannot be lost is not a grade. If the kappa_pack floors move materially, or if FND-037's quadratic-nonlinearity form is refuted, this assembly's grade returns to adjudication rather than keeping the label by seniority.</w:t>
+      </w:r>
+    </w:p>
+    <w:p>
+      <w:r>
+        <w:t xml:space="preserve">A downstream correction belongs with this section. EM-RECON-015's effective vacuum mass density of ~1e8 kg/m^3 was computed from the superseded ~1e25 Sigma and is stale by ten to twelve orders. The live figures are 4.0e18 kg/m^3 on Sigma_eff - matching FND-031's independently registered fence of 17.5x nuclear - and 2.0e20 on the 3T0/a^2 reading. The vacuum-energy problem that claim flagged is therefore substantially larger than it states, not smaller.</w:t>
       </w:r>
     </w:p>
     <w:p>

</xml_diff>

<commit_message>
Sync to v3.31.0 (Mesh Programme rename)
</commit_message>
<xml_diff>
--- a/papers/_sources/em_field_tensor_dictionary.docx
+++ b/papers/_sources/em_field_tensor_dictionary.docx
@@ -649,6 +649,109 @@
       </w:r>
     </w:p>
     <w:p>
+      <w:pPr>
+        <w:spacing w:after="160" w:before="0" w:line="276"/>
+        <w:jc w:val="both"/>
+      </w:pPr>
+      <w:r>
+        <w:rPr>
+          <w:rFonts w:ascii="Times New Roman" w:cs="Times New Roman" w:eastAsia="Times New Roman" w:hAnsi="Times New Roman"/>
+          <w:sz w:val="24"/>
+          <w:szCs w:val="24"/>
+        </w:rPr>
+        <w:t xml:space="preserve">Naming note (5 September 2026). This programme is now the Mesh Programme and the theory it develops the mesh framework; 'the rope framework' in earlier revisions reads 'the mesh framework'. 'Rope' remains the name of the two-strand wound object, and the Rope Hypothesis credited to Bill Gaede keeps its name. Identifiers (repository, rope_solver, file names, claim IDs) are unchanged.</w:t>
+      </w:r>
+    </w:p>
+    <w:p>
+      <w:pPr>
+        <w:pStyle w:val="Heading1"/>
+        <w:spacing w:after="140" w:before="320"/>
+      </w:pPr>
+      <w:r>
+        <w:rPr>
+          <w:rFonts w:ascii="Times New Roman" w:cs="Times New Roman" w:eastAsia="Times New Roman" w:hAnsi="Times New Roman"/>
+          <w:b/>
+          <w:bCs/>
+          <w:color w:val="1F3864"/>
+          <w:sz w:val="28"/>
+          <w:szCs w:val="28"/>
+        </w:rPr>
+        <w:t xml:space="preserve">6. The connection fixed: A is the rotated collective displacement (E-RECON, 5 September 2026)</w:t>
+      </w:r>
+    </w:p>
+    <w:p>
+      <w:pPr>
+        <w:spacing w:after="160" w:before="0" w:line="276"/>
+        <w:jc w:val="both"/>
+      </w:pPr>
+      <w:r>
+        <w:rPr>
+          <w:rFonts w:ascii="Times New Roman" w:cs="Times New Roman" w:eastAsia="Times New Roman" w:hAnsi="Times New Roman"/>
+          <w:b/>
+          <w:bCs/>
+          <w:sz w:val="24"/>
+          <w:szCs w:val="24"/>
+        </w:rPr>
+        <w:t xml:space="preserve">The gap that surfaced. </w:t>
+      </w:r>
+      <w:r>
+        <w:rPr>
+          <w:rFonts w:ascii="Times New Roman" w:cs="Times New Roman" w:eastAsia="Times New Roman" w:hAnsi="Times New Roman"/>
+          <w:sz w:val="24"/>
+          <w:szCs w:val="24"/>
+        </w:rPr>
+        <w:t xml:space="preserve">The dictionary's Faraday half, E = -grad φ - dA/dt with A the orientation connection (EM-016), and the Magnus force identification E = ρκ₀(v_medium × ẑ) (EM-RECON-026) were both Derived-class statements about the same field, and until a boundary question was put to them nobody had checked that they agree. Commission CASIMIR-PLATE asked what a perfect conductor (tangential E = 0) imposes on the medium and found that, read as 'the strand slope', the connection gives a Neumann-class condition on the collective transverse displacement while the Magnus form gives a Dirichlet-class one; worse, for a transverse plane wave the two readings did not even agree on the polarization of E. The commission halted at its reading leg (CAS-BC-OPEN), as its charter required.</w:t>
+      </w:r>
+    </w:p>
+    <w:p>
+      <w:pPr>
+        <w:spacing w:after="160" w:before="0" w:line="276"/>
+        <w:jc w:val="both"/>
+      </w:pPr>
+      <w:r>
+        <w:rPr>
+          <w:rFonts w:ascii="Times New Roman" w:cs="Times New Roman" w:eastAsia="Times New Roman" w:hAnsi="Times New Roman"/>
+          <w:b/>
+          <w:bCs/>
+          <w:sz w:val="24"/>
+          <w:szCs w:val="24"/>
+        </w:rPr>
+        <w:t xml:space="preserve">The reconciliation. </w:t>
+      </w:r>
+      <w:r>
+        <w:rPr>
+          <w:rFonts w:ascii="Times New Roman" w:cs="Times New Roman" w:eastAsia="Times New Roman" w:hAnsi="Times New Roman"/>
+          <w:sz w:val="24"/>
+          <w:szCs w:val="24"/>
+        </w:rPr>
+        <w:t xml:space="preserve">Commission E-RECON (analysis/ERECON_results.md; EM-023, registered) fixed two candidate identifications of A in advance, the tilt ds/dz and the rotated displacement, and tested each symbolically against four conditions: pointwise agreement of -dA/dt with the Magnus E for every medium motion, transverse E for a transverse plane wave, GG-004's gauge content, and reproduction of the Magnus form's constant B′ = -ρκ₀ẑ as the background of curl A. Exactly one candidate passes all four: A = -ρκ₀ (s × ẑ), with s the collective transverse displacement of EM-RECON-025. Under it -dA/dt = ρκ₀(v × ẑ) identically; a transverse wave along z polarized in x gives E = ρκ₀ f′ ŷ, in-plane and transverse; a uniform translation of s shifts A by the gradient of a linear function, pure gauge; and curl A = -κ₀ρ ∂s/∂z in-plane plus ρκ₀ div_⊥ s along z, which is exactly B = -κ₀ ρ_total ẑ with ρ_total = ρ(1 - div_⊥ s): the Magnus B′ is the unperturbed background, its perturbation the mesh compression, and the in-plane part the strand tilt. B is minus κ₀ times the strand-direction flux density, which makes literal the phrase this dictionary already used for the static field, 'rest-tension flux geometry, rope count' (EM-RECON-011).</w:t>
+      </w:r>
+    </w:p>
+    <w:p>
+      <w:pPr>
+        <w:spacing w:after="160" w:before="0" w:line="276"/>
+        <w:jc w:val="both"/>
+      </w:pPr>
+      <w:r>
+        <w:rPr>
+          <w:rFonts w:ascii="Times New Roman" w:cs="Times New Roman" w:eastAsia="Times New Roman" w:hAnsi="Times New Roman"/>
+          <w:b/>
+          <w:bCs/>
+          <w:sz w:val="24"/>
+          <w:szCs w:val="24"/>
+        </w:rPr>
+        <w:t xml:space="preserve">What changes in the table above. </w:t>
+      </w:r>
+      <w:r>
+        <w:rPr>
+          <w:rFonts w:ascii="Times New Roman" w:cs="Times New Roman" w:eastAsia="Times New Roman" w:hAnsi="Times New Roman"/>
+          <w:sz w:val="24"/>
+          <w:szCs w:val="24"/>
+        </w:rPr>
+        <w:t xml:space="preserve">The row for the vector potential keeps its status; its mechanical identity is now stated precisely: the orientation connection is the rotated collective displacement, and 'orientation-transport rate' in the E row reads as the rate of the transported displacement, not the strand slope. The tilt candidate gives a different field for the same motion and is excluded. EM-016's grade is untouched; a reading it left open is fixed, consistent with EM-017's operational uniqueness. The corollary the boundary question was waiting for follows uniquely: a perfect conductor pins the tangential collective displacement at the plate (Dirichlet on both transverse bands, effective separation d + 1 on the lattice) and levels the twist-tension field φ along it. The Casimir computation this unblocked is in progress; its result belongs to a later revision of this paper.</w:t>
+      </w:r>
+    </w:p>
+    <w:p>
       <w:r>
         <w:rPr>
           <w:b/>
@@ -703,6 +806,30 @@
       </w:r>
       <w:r>
         <w:t>THE FIELD-TENSOR DICTIONARY  [benchmark: benchmarks/em/electrostatic_sign_derivation.py]</w:t>
+      </w:r>
+    </w:p>
+    <w:p>
+      <w:pPr>
+        <w:spacing w:after="160" w:before="0" w:line="276"/>
+        <w:jc w:val="both"/>
+      </w:pPr>
+      <w:r>
+        <w:rPr>
+          <w:rFonts w:ascii="Times New Roman" w:cs="Times New Roman" w:eastAsia="Times New Roman" w:hAnsi="Times New Roman"/>
+          <w:b/>
+          <w:bCs/>
+          <w:sz w:val="24"/>
+          <w:szCs w:val="24"/>
+        </w:rPr>
+        <w:t xml:space="preserve">• EM-023 [registered]: </w:t>
+      </w:r>
+      <w:r>
+        <w:rPr>
+          <w:rFonts w:ascii="Times New Roman" w:cs="Times New Roman" w:eastAsia="Times New Roman" w:hAnsi="Times New Roman"/>
+          <w:sz w:val="24"/>
+          <w:szCs w:val="24"/>
+        </w:rPr>
+        <w:t xml:space="preserve">THE ORIENTATION CONNECTION IS THE ROTATED COLLECTIVE DISPLACEMENT, A = -ρκ₀ (s × ẑ); EM-016's E and EM-RECON-026's E are one field; a perfect conductor pins the tangential displacement (analysis/ERECON_results.md)</w:t>
       </w:r>
     </w:p>
     <w:sectPr>

</xml_diff>